<commit_message>
Fix NewLayer build piston not lowering full layer thickness
Skip the intermediate clearance offset so the build piston drops
directly to the correct height in one move instead of relying on a
now-disabled post-spread trim step. Also reduce piston clearance
1.5mm -> 0.25mm.

Co-Authored-By: Claude Sonnet 5 <noreply@anthropic.com>
</commit_message>
<xml_diff>
--- a/Oasis_3D_printer_SOP_v3_0.docx
+++ b/Oasis_3D_printer_SOP_v3_0.docx
@@ -50,7 +50,7 @@
         <w:spacing w:after="0"/>
         <w:jc w:val="center"/>
         <w:rPr>
-          <w:rFonts w:ascii="Calibri" w:hAnsi="Calibri" w:cs="Calibri" w:hint="eastAsia"/>
+          <w:rFonts w:ascii="Calibri" w:hAnsi="Calibri" w:cs="Calibri"/>
         </w:rPr>
       </w:pPr>
       <w:r>
@@ -719,10 +719,10 @@
           <w:noProof/>
         </w:rPr>
         <w:drawing>
-          <wp:inline distT="0" distB="0" distL="0" distR="0" wp14:anchorId="2C2F8A19" wp14:editId="3D8F2DF2">
-            <wp:extent cx="5939790" cy="3841973"/>
-            <wp:effectExtent l="0" t="0" r="3810" b="0"/>
-            <wp:docPr id="1868265806" name="Picture 1"/>
+          <wp:inline distT="0" distB="0" distL="0" distR="0" wp14:anchorId="490CBB54" wp14:editId="54EC73B9">
+            <wp:extent cx="6419850" cy="4072255"/>
+            <wp:effectExtent l="0" t="0" r="0" b="0"/>
+            <wp:docPr id="1346535516" name="Picture 1"/>
             <wp:cNvGraphicFramePr>
               <a:graphicFrameLocks xmlns:a="http://schemas.openxmlformats.org/drawingml/2006/main" noChangeAspect="1"/>
             </wp:cNvGraphicFramePr>
@@ -751,7 +751,7 @@
                   <pic:spPr bwMode="auto">
                     <a:xfrm>
                       <a:off x="0" y="0"/>
-                      <a:ext cx="5946825" cy="3846523"/>
+                      <a:ext cx="6419850" cy="4072255"/>
                     </a:xfrm>
                     <a:prstGeom prst="rect">
                       <a:avLst/>
@@ -1530,9 +1530,9 @@
         <w:tblLook w:val="04A0" w:firstRow="1" w:lastRow="0" w:firstColumn="1" w:lastColumn="0" w:noHBand="0" w:noVBand="1"/>
       </w:tblPr>
       <w:tblGrid>
-        <w:gridCol w:w="900"/>
-        <w:gridCol w:w="2643"/>
-        <w:gridCol w:w="5817"/>
+        <w:gridCol w:w="899"/>
+        <w:gridCol w:w="2638"/>
+        <w:gridCol w:w="5823"/>
       </w:tblGrid>
       <w:tr>
         <w:tc>
@@ -1877,10 +1877,10 @@
               </w:rPr>
               <w:lastRenderedPageBreak/>
               <w:drawing>
-                <wp:inline distT="0" distB="0" distL="0" distR="0" wp14:anchorId="1FB74404" wp14:editId="63B04568">
-                  <wp:extent cx="2896074" cy="3604260"/>
-                  <wp:effectExtent l="0" t="0" r="0" b="0"/>
-                  <wp:docPr id="218955780" name="Picture 2"/>
+                <wp:inline distT="0" distB="0" distL="0" distR="0" wp14:anchorId="2CF6BFF8" wp14:editId="0AA79CC2">
+                  <wp:extent cx="2805545" cy="3383770"/>
+                  <wp:effectExtent l="0" t="0" r="0" b="7620"/>
+                  <wp:docPr id="727040315" name="Picture 2"/>
                   <wp:cNvGraphicFramePr>
                     <a:graphicFrameLocks xmlns:a="http://schemas.openxmlformats.org/drawingml/2006/main" noChangeAspect="1"/>
                   </wp:cNvGraphicFramePr>
@@ -1909,7 +1909,7 @@
                         <pic:spPr bwMode="auto">
                           <a:xfrm>
                             <a:off x="0" y="0"/>
-                            <a:ext cx="2909358" cy="3620793"/>
+                            <a:ext cx="2823318" cy="3405206"/>
                           </a:xfrm>
                           <a:prstGeom prst="rect">
                             <a:avLst/>
@@ -1962,10 +1962,10 @@
                 <w:szCs w:val="20"/>
               </w:rPr>
               <w:drawing>
-                <wp:inline distT="0" distB="0" distL="0" distR="0" wp14:anchorId="0A1022BF" wp14:editId="280BB1C9">
-                  <wp:extent cx="2880360" cy="1478162"/>
-                  <wp:effectExtent l="0" t="0" r="0" b="8255"/>
-                  <wp:docPr id="1284716613" name="Picture 3"/>
+                <wp:inline distT="0" distB="0" distL="0" distR="0" wp14:anchorId="1E9B01D7" wp14:editId="5087F3FA">
+                  <wp:extent cx="2805900" cy="1918104"/>
+                  <wp:effectExtent l="0" t="0" r="0" b="6350"/>
+                  <wp:docPr id="923164186" name="Picture 3"/>
                   <wp:cNvGraphicFramePr>
                     <a:graphicFrameLocks xmlns:a="http://schemas.openxmlformats.org/drawingml/2006/main" noChangeAspect="1"/>
                   </wp:cNvGraphicFramePr>
@@ -1994,7 +1994,7 @@
                         <pic:spPr bwMode="auto">
                           <a:xfrm>
                             <a:off x="0" y="0"/>
-                            <a:ext cx="2897095" cy="1486750"/>
+                            <a:ext cx="2819831" cy="1927627"/>
                           </a:xfrm>
                           <a:prstGeom prst="rect">
                             <a:avLst/>
@@ -2203,10 +2203,10 @@
                 <w:szCs w:val="20"/>
               </w:rPr>
               <w:drawing>
-                <wp:inline distT="0" distB="0" distL="0" distR="0" wp14:anchorId="0E7DC285" wp14:editId="2C206EFD">
-                  <wp:extent cx="3066415" cy="2573020"/>
-                  <wp:effectExtent l="0" t="0" r="635" b="0"/>
-                  <wp:docPr id="1460668808" name="Picture 4"/>
+                <wp:inline distT="0" distB="0" distL="0" distR="0" wp14:anchorId="76620DC3" wp14:editId="054BC53B">
+                  <wp:extent cx="2895600" cy="1548765"/>
+                  <wp:effectExtent l="0" t="0" r="0" b="0"/>
+                  <wp:docPr id="501806626" name="Picture 4"/>
                   <wp:cNvGraphicFramePr>
                     <a:graphicFrameLocks xmlns:a="http://schemas.openxmlformats.org/drawingml/2006/main" noChangeAspect="1"/>
                   </wp:cNvGraphicFramePr>
@@ -2235,7 +2235,7 @@
                         <pic:spPr bwMode="auto">
                           <a:xfrm>
                             <a:off x="0" y="0"/>
-                            <a:ext cx="3066415" cy="2573020"/>
+                            <a:ext cx="2895600" cy="1548765"/>
                           </a:xfrm>
                           <a:prstGeom prst="rect">
                             <a:avLst/>
@@ -2253,11 +2253,29 @@
             <w:pPr>
               <w:spacing w:after="0"/>
               <w:rPr>
+                <w:rFonts w:ascii="Calibri" w:hAnsi="Calibri" w:cs="Calibri"/>
+                <w:sz w:val="20"/>
+                <w:szCs w:val="20"/>
+              </w:rPr>
+            </w:pPr>
+            <w:r>
+              <w:rPr>
                 <w:rFonts w:ascii="Calibri" w:hAnsi="Calibri" w:cs="Calibri" w:hint="eastAsia"/>
                 <w:sz w:val="20"/>
                 <w:szCs w:val="20"/>
-              </w:rPr>
-            </w:pPr>
+                <w:u w:val="single"/>
+              </w:rPr>
+              <w:t xml:space="preserve">** CRITICAL </w:t>
+            </w:r>
+            <w:r>
+              <w:rPr>
+                <w:rFonts w:ascii="Calibri" w:hAnsi="Calibri" w:cs="Calibri"/>
+                <w:sz w:val="20"/>
+                <w:szCs w:val="20"/>
+                <w:u w:val="single"/>
+              </w:rPr>
+              <w:t>CAUTION:</w:t>
+            </w:r>
             <w:r>
               <w:rPr>
                 <w:rFonts w:ascii="Calibri" w:hAnsi="Calibri" w:cs="Calibri" w:hint="eastAsia"/>
@@ -2265,25 +2283,23 @@
                 <w:szCs w:val="20"/>
                 <w:u w:val="single"/>
               </w:rPr>
-              <w:t xml:space="preserve">** CRITICAL </w:t>
-            </w:r>
-            <w:r>
-              <w:rPr>
-                <w:rFonts w:ascii="Calibri" w:hAnsi="Calibri" w:cs="Calibri"/>
-                <w:sz w:val="20"/>
-                <w:szCs w:val="20"/>
-                <w:u w:val="single"/>
-              </w:rPr>
-              <w:t>CAUTION:</w:t>
+              <w:t xml:space="preserve"> </w:t>
             </w:r>
             <w:r>
               <w:rPr>
                 <w:rFonts w:ascii="Calibri" w:hAnsi="Calibri" w:cs="Calibri" w:hint="eastAsia"/>
                 <w:sz w:val="20"/>
                 <w:szCs w:val="20"/>
-                <w:u w:val="single"/>
-              </w:rPr>
-              <w:t xml:space="preserve"> </w:t>
+              </w:rPr>
+              <w:t xml:space="preserve">Emergency Unlock should be </w:t>
+            </w:r>
+            <w:r>
+              <w:rPr>
+                <w:rFonts w:ascii="Calibri" w:hAnsi="Calibri" w:cs="Calibri"/>
+                <w:sz w:val="20"/>
+                <w:szCs w:val="20"/>
+              </w:rPr>
+              <w:t>avoided</w:t>
             </w:r>
             <w:r>
               <w:rPr>
@@ -2291,41 +2307,24 @@
                 <w:sz w:val="20"/>
                 <w:szCs w:val="20"/>
               </w:rPr>
-              <w:t xml:space="preserve">Emergency Unlock should be </w:t>
-            </w:r>
-            <w:r>
-              <w:rPr>
-                <w:rFonts w:ascii="Calibri" w:hAnsi="Calibri" w:cs="Calibri"/>
-                <w:sz w:val="20"/>
-                <w:szCs w:val="20"/>
-              </w:rPr>
-              <w:t>avoided</w:t>
-            </w:r>
+              <w:t xml:space="preserve">, the system must be homed first under normal operation. </w:t>
+            </w:r>
+          </w:p>
+          <w:p>
+            <w:pPr>
+              <w:spacing w:after="0"/>
+              <w:rPr>
+                <w:rFonts w:ascii="Calibri" w:hAnsi="Calibri" w:cs="Calibri"/>
+                <w:sz w:val="20"/>
+                <w:szCs w:val="20"/>
+              </w:rPr>
+            </w:pPr>
             <w:r>
               <w:rPr>
                 <w:rFonts w:ascii="Calibri" w:hAnsi="Calibri" w:cs="Calibri" w:hint="eastAsia"/>
                 <w:sz w:val="20"/>
                 <w:szCs w:val="20"/>
               </w:rPr>
-              <w:t xml:space="preserve">, the system must be homed first under normal operation. </w:t>
-            </w:r>
-          </w:p>
-          <w:p>
-            <w:pPr>
-              <w:spacing w:after="0"/>
-              <w:rPr>
-                <w:rFonts w:ascii="Calibri" w:hAnsi="Calibri" w:cs="Calibri" w:hint="eastAsia"/>
-                <w:sz w:val="20"/>
-                <w:szCs w:val="20"/>
-              </w:rPr>
-            </w:pPr>
-            <w:r>
-              <w:rPr>
-                <w:rFonts w:ascii="Calibri" w:hAnsi="Calibri" w:cs="Calibri" w:hint="eastAsia"/>
-                <w:sz w:val="20"/>
-                <w:szCs w:val="20"/>
-              </w:rPr>
-              <w:lastRenderedPageBreak/>
               <w:t xml:space="preserve">But if a motion control bypass is required </w:t>
             </w:r>
             <w:r>
@@ -2671,10 +2670,10 @@
                 <w:noProof/>
               </w:rPr>
               <w:drawing>
-                <wp:inline distT="0" distB="0" distL="0" distR="0" wp14:anchorId="67CB83A3" wp14:editId="40578810">
-                  <wp:extent cx="1725003" cy="1058002"/>
-                  <wp:effectExtent l="0" t="0" r="8890" b="8890"/>
-                  <wp:docPr id="1945920708" name="Picture 12"/>
+                <wp:inline distT="0" distB="0" distL="0" distR="0" wp14:anchorId="6C43E11A" wp14:editId="36D05FD2">
+                  <wp:extent cx="2883535" cy="944880"/>
+                  <wp:effectExtent l="0" t="0" r="0" b="7620"/>
+                  <wp:docPr id="519129956" name="Picture 7"/>
                   <wp:cNvGraphicFramePr>
                     <a:graphicFrameLocks xmlns:a="http://schemas.openxmlformats.org/drawingml/2006/main" noChangeAspect="1"/>
                   </wp:cNvGraphicFramePr>
@@ -2682,7 +2681,7 @@
                     <a:graphicData uri="http://schemas.openxmlformats.org/drawingml/2006/picture">
                       <pic:pic xmlns:pic="http://schemas.openxmlformats.org/drawingml/2006/picture">
                         <pic:nvPicPr>
-                          <pic:cNvPr id="0" name="Picture 12"/>
+                          <pic:cNvPr id="0" name="Picture 8"/>
                           <pic:cNvPicPr>
                             <a:picLocks noChangeAspect="1" noChangeArrowheads="1"/>
                           </pic:cNvPicPr>
@@ -2703,7 +2702,7 @@
                         <pic:spPr bwMode="auto">
                           <a:xfrm>
                             <a:off x="0" y="0"/>
-                            <a:ext cx="1730619" cy="1061447"/>
+                            <a:ext cx="2883535" cy="944880"/>
                           </a:xfrm>
                           <a:prstGeom prst="rect">
                             <a:avLst/>
@@ -2864,10 +2863,10 @@
                 <w:szCs w:val="20"/>
               </w:rPr>
               <w:drawing>
-                <wp:inline distT="0" distB="0" distL="0" distR="0" wp14:anchorId="29D4646D" wp14:editId="3A6705B3">
-                  <wp:extent cx="3311611" cy="1776018"/>
-                  <wp:effectExtent l="0" t="0" r="3175" b="0"/>
-                  <wp:docPr id="630990426" name="Picture 11"/>
+                <wp:inline distT="0" distB="0" distL="0" distR="0" wp14:anchorId="6AABF2CF" wp14:editId="2A82BD02">
+                  <wp:extent cx="3545205" cy="847050"/>
+                  <wp:effectExtent l="0" t="0" r="0" b="0"/>
+                  <wp:docPr id="61095268" name="Picture 8"/>
                   <wp:cNvGraphicFramePr>
                     <a:graphicFrameLocks xmlns:a="http://schemas.openxmlformats.org/drawingml/2006/main" noChangeAspect="1"/>
                   </wp:cNvGraphicFramePr>
@@ -2875,7 +2874,7 @@
                     <a:graphicData uri="http://schemas.openxmlformats.org/drawingml/2006/picture">
                       <pic:pic xmlns:pic="http://schemas.openxmlformats.org/drawingml/2006/picture">
                         <pic:nvPicPr>
-                          <pic:cNvPr id="0" name="Picture 11"/>
+                          <pic:cNvPr id="0" name="Picture 9"/>
                           <pic:cNvPicPr>
                             <a:picLocks noChangeAspect="1" noChangeArrowheads="1"/>
                           </pic:cNvPicPr>
@@ -2896,7 +2895,7 @@
                         <pic:spPr bwMode="auto">
                           <a:xfrm>
                             <a:off x="0" y="0"/>
-                            <a:ext cx="3341296" cy="1791938"/>
+                            <a:ext cx="3575507" cy="854290"/>
                           </a:xfrm>
                           <a:prstGeom prst="rect">
                             <a:avLst/>
@@ -3078,10 +3077,10 @@
                 <w:szCs w:val="20"/>
               </w:rPr>
               <w:drawing>
-                <wp:inline distT="0" distB="0" distL="0" distR="0" wp14:anchorId="34F94272" wp14:editId="66866BC5">
-                  <wp:extent cx="1391371" cy="875791"/>
-                  <wp:effectExtent l="0" t="0" r="0" b="635"/>
-                  <wp:docPr id="128597959" name="Picture 6"/>
+                <wp:inline distT="0" distB="0" distL="0" distR="0" wp14:anchorId="3C425AE8" wp14:editId="7400906D">
+                  <wp:extent cx="2895600" cy="951230"/>
+                  <wp:effectExtent l="0" t="0" r="0" b="1270"/>
+                  <wp:docPr id="1494135992" name="Picture 5"/>
                   <wp:cNvGraphicFramePr>
                     <a:graphicFrameLocks xmlns:a="http://schemas.openxmlformats.org/drawingml/2006/main" noChangeAspect="1"/>
                   </wp:cNvGraphicFramePr>
@@ -3095,7 +3094,7 @@
                           </pic:cNvPicPr>
                         </pic:nvPicPr>
                         <pic:blipFill>
-                          <a:blip r:embed="rId13" cstate="print">
+                          <a:blip r:embed="rId13">
                             <a:extLst>
                               <a:ext uri="{28A0092B-C50C-407E-A947-70E740481C1C}">
                                 <a14:useLocalDpi xmlns:a14="http://schemas.microsoft.com/office/drawing/2010/main" val="0"/>
@@ -3110,7 +3109,7 @@
                         <pic:spPr bwMode="auto">
                           <a:xfrm>
                             <a:off x="0" y="0"/>
-                            <a:ext cx="1394832" cy="877969"/>
+                            <a:ext cx="2895600" cy="951230"/>
                           </a:xfrm>
                           <a:prstGeom prst="rect">
                             <a:avLst/>
@@ -3425,12 +3424,11 @@
                 <w:sz w:val="20"/>
                 <w:szCs w:val="20"/>
               </w:rPr>
-              <w:lastRenderedPageBreak/>
               <w:drawing>
-                <wp:inline distT="0" distB="0" distL="0" distR="0" wp14:anchorId="341D5570" wp14:editId="60A87A41">
-                  <wp:extent cx="3395637" cy="1814734"/>
-                  <wp:effectExtent l="0" t="0" r="0" b="0"/>
-                  <wp:docPr id="848648503" name="Picture 10"/>
+                <wp:inline distT="0" distB="0" distL="0" distR="0" wp14:anchorId="049C15EE" wp14:editId="298BD29D">
+                  <wp:extent cx="2895600" cy="951230"/>
+                  <wp:effectExtent l="0" t="0" r="0" b="1270"/>
+                  <wp:docPr id="1605248384" name="Picture 6"/>
                   <wp:cNvGraphicFramePr>
                     <a:graphicFrameLocks xmlns:a="http://schemas.openxmlformats.org/drawingml/2006/main" noChangeAspect="1"/>
                   </wp:cNvGraphicFramePr>
@@ -3438,13 +3436,13 @@
                     <a:graphicData uri="http://schemas.openxmlformats.org/drawingml/2006/picture">
                       <pic:pic xmlns:pic="http://schemas.openxmlformats.org/drawingml/2006/picture">
                         <pic:nvPicPr>
-                          <pic:cNvPr id="0" name="Picture 10"/>
+                          <pic:cNvPr id="0" name="Picture 7"/>
                           <pic:cNvPicPr>
                             <a:picLocks noChangeAspect="1" noChangeArrowheads="1"/>
                           </pic:cNvPicPr>
                         </pic:nvPicPr>
                         <pic:blipFill>
-                          <a:blip r:embed="rId14" cstate="print">
+                          <a:blip r:embed="rId14">
                             <a:extLst>
                               <a:ext uri="{28A0092B-C50C-407E-A947-70E740481C1C}">
                                 <a14:useLocalDpi xmlns:a14="http://schemas.microsoft.com/office/drawing/2010/main" val="0"/>
@@ -3459,7 +3457,7 @@
                         <pic:spPr bwMode="auto">
                           <a:xfrm>
                             <a:off x="0" y="0"/>
-                            <a:ext cx="3429534" cy="1832849"/>
+                            <a:ext cx="2895600" cy="951230"/>
                           </a:xfrm>
                           <a:prstGeom prst="rect">
                             <a:avLst/>
@@ -3510,7 +3508,6 @@
                 <w:sz w:val="20"/>
                 <w:szCs w:val="20"/>
               </w:rPr>
-              <w:lastRenderedPageBreak/>
               <w:t>8</w:t>
             </w:r>
           </w:p>
@@ -3780,7 +3777,7 @@
             <w:pPr>
               <w:spacing w:after="0"/>
               <w:rPr>
-                <w:rFonts w:ascii="Calibri" w:hAnsi="Calibri" w:cs="Calibri" w:hint="eastAsia"/>
+                <w:rFonts w:ascii="Calibri" w:hAnsi="Calibri" w:cs="Calibri"/>
                 <w:sz w:val="20"/>
                 <w:szCs w:val="20"/>
               </w:rPr>
@@ -3943,6 +3940,7 @@
                 <w:sz w:val="20"/>
                 <w:szCs w:val="20"/>
               </w:rPr>
+              <w:lastRenderedPageBreak/>
               <w:drawing>
                 <wp:inline distT="0" distB="0" distL="0" distR="0" wp14:anchorId="5FA0C1AD" wp14:editId="2E7AC87F">
                   <wp:extent cx="2815590" cy="3621629"/>
@@ -4027,6 +4025,7 @@
                 <w:sz w:val="20"/>
                 <w:szCs w:val="20"/>
               </w:rPr>
+              <w:lastRenderedPageBreak/>
               <w:t>10</w:t>
             </w:r>
           </w:p>
@@ -4220,7 +4219,6 @@
                 <w:sz w:val="20"/>
                 <w:szCs w:val="20"/>
               </w:rPr>
-              <w:lastRenderedPageBreak/>
               <w:drawing>
                 <wp:inline distT="0" distB="0" distL="0" distR="0" wp14:anchorId="1AED59B8" wp14:editId="228C886C">
                   <wp:extent cx="3268980" cy="2526857"/>
@@ -4359,6 +4357,7 @@
                 <w:sz w:val="20"/>
                 <w:szCs w:val="20"/>
               </w:rPr>
+              <w:lastRenderedPageBreak/>
               <w:drawing>
                 <wp:inline distT="0" distB="0" distL="0" distR="0" wp14:anchorId="64BBD8BB" wp14:editId="43294D70">
                   <wp:extent cx="3280410" cy="3221519"/>

</xml_diff>